<commit_message>
Update video script and team reference guide with all new features (Q&A, Multi-Audit, Groq, 8 audits)
</commit_message>
<xml_diff>
--- a/docs/team_reference_guide.docx
+++ b/docs/team_reference_guide.docx
@@ -19,7 +19,7 @@
         <w:rPr>
           <w:b/>
         </w:rPr>
-        <w:t>Ido Cohen &amp; Zach Bar | CSUN AI Jam 2026</w:t>
+        <w:t>Quick-reference for data rules, demo datasets, and AI/API components</w:t>
       </w:r>
     </w:p>
     <w:p/>
@@ -31,96 +31,56 @@
         <w:rPr>
           <w:color w:val="CF0A2C"/>
         </w:rPr>
-        <w:t>1. Data Rules -- What We Can and Cannot Use</w:t>
+        <w:t>Section 1: Data Rules</w:t>
       </w:r>
     </w:p>
+    <w:p>
+      <w:r>
+        <w:t>All data used in MatadorAudit is synthetic. No real CSUN student records were accessed, uploaded, or shared with any AI platform.</w:t>
+      </w:r>
+    </w:p>
+    <w:p/>
     <w:p>
       <w:pPr>
         <w:pStyle w:val="Heading2"/>
       </w:pPr>
       <w:r>
-        <w:t>What the competition rules say:</w:t>
+        <w:t>Synthetic Data Demographics (modeled on public CSUN data)</w:t>
       </w:r>
     </w:p>
     <w:p>
-      <w:pPr>
-        <w:pStyle w:val="IntenseQuote"/>
-      </w:pPr>
       <w:r>
-        <w:t>"No CSUN, confidential, or sensitive data may be uploaded to AI platforms, including personal data."</w:t>
-      </w:r>
-    </w:p>
-    <w:p>
-      <w:pPr>
-        <w:pStyle w:val="IntenseQuote"/>
-      </w:pPr>
-      <w:r>
-        <w:t>"Although you may not use real CSUN data during proposal development, you may conceptually describe how such data could be used in a real implementation. You can also choose to work with simulated or hypothetical data to explore ideas responsibly."</w:t>
-      </w:r>
-    </w:p>
-    <w:p>
-      <w:pPr>
-        <w:pStyle w:val="Heading2"/>
-      </w:pPr>
-      <w:r>
-        <w:t>What we ARE allowed to do:</w:t>
-      </w:r>
-    </w:p>
-    <w:p>
-      <w:pPr>
-        <w:pStyle w:val="ListBullet"/>
-      </w:pPr>
-      <w:r>
-        <w:t>Use publicly available aggregate data (which we already do)</w:t>
-      </w:r>
-    </w:p>
-    <w:p>
-      <w:pPr>
-        <w:pStyle w:val="ListBullet"/>
-      </w:pPr>
-      <w:r>
-        <w:t>Our synthetic dataset is modeled on real numbers from these public sources:</w:t>
+        <w:t>The synthetic dataset reflects real CSUN demographic proportions from publicly available sources:</w:t>
       </w:r>
     </w:p>
     <w:tbl>
       <w:tblPr>
-        <w:tblStyle w:val="MediumShading1-Accent1"/>
+        <w:tblStyle w:val="LightGrid-Accent1"/>
         <w:tblW w:type="auto" w:w="0"/>
         <w:tblLook w:firstColumn="1" w:firstRow="1" w:lastColumn="0" w:lastRow="0" w:noHBand="0" w:noVBand="1" w:val="04A0"/>
       </w:tblPr>
       <w:tblGrid>
-        <w:gridCol w:w="2880"/>
-        <w:gridCol w:w="2880"/>
-        <w:gridCol w:w="2880"/>
+        <w:gridCol w:w="4320"/>
+        <w:gridCol w:w="4320"/>
       </w:tblGrid>
       <w:tr>
         <w:tc>
           <w:tcPr>
-            <w:tcW w:type="dxa" w:w="2880"/>
+            <w:tcW w:type="dxa" w:w="4320"/>
           </w:tcPr>
           <w:p>
             <w:r>
-              <w:t>Source</w:t>
+              <w:t>Demographic</w:t>
             </w:r>
           </w:p>
         </w:tc>
         <w:tc>
           <w:tcPr>
-            <w:tcW w:type="dxa" w:w="2880"/>
+            <w:tcW w:type="dxa" w:w="4320"/>
           </w:tcPr>
           <w:p>
             <w:r>
-              <w:t>URL</w:t>
-            </w:r>
-          </w:p>
-        </w:tc>
-        <w:tc>
-          <w:tcPr>
-            <w:tcW w:type="dxa" w:w="2880"/>
-          </w:tcPr>
-          <w:p>
-            <w:r>
-              <w:t>What We Use</w:t>
+              <w:t>Proportion</w:t>
             </w:r>
           </w:p>
         </w:tc>
@@ -128,31 +88,21 @@
       <w:tr>
         <w:tc>
           <w:tcPr>
-            <w:tcW w:type="dxa" w:w="2880"/>
+            <w:tcW w:type="dxa" w:w="4320"/>
           </w:tcPr>
           <w:p>
             <w:r>
-              <w:t>CSUN Institutional Research</w:t>
+              <w:t>Hispanic/Latino</w:t>
             </w:r>
           </w:p>
         </w:tc>
         <w:tc>
           <w:tcPr>
-            <w:tcW w:type="dxa" w:w="2880"/>
+            <w:tcW w:type="dxa" w:w="4320"/>
           </w:tcPr>
           <w:p>
             <w:r>
-              <w:t>csun.edu/counts/demographic.php</w:t>
-            </w:r>
-          </w:p>
-        </w:tc>
-        <w:tc>
-          <w:tcPr>
-            <w:tcW w:type="dxa" w:w="2880"/>
-          </w:tcPr>
-          <w:p>
-            <w:r>
-              <w:t>Race/ethnicity percentages, gender breakdown</w:t>
+              <w:t>56.2%</w:t>
             </w:r>
           </w:p>
         </w:tc>
@@ -160,31 +110,21 @@
       <w:tr>
         <w:tc>
           <w:tcPr>
-            <w:tcW w:type="dxa" w:w="2880"/>
+            <w:tcW w:type="dxa" w:w="4320"/>
           </w:tcPr>
           <w:p>
             <w:r>
-              <w:t>CSUN Fact Sheet</w:t>
+              <w:t>Pell-Eligible</w:t>
             </w:r>
           </w:p>
         </w:tc>
         <w:tc>
           <w:tcPr>
-            <w:tcW w:type="dxa" w:w="2880"/>
+            <w:tcW w:type="dxa" w:w="4320"/>
           </w:tcPr>
           <w:p>
             <w:r>
-              <w:t>csun.edu/about/facts</w:t>
-            </w:r>
-          </w:p>
-        </w:tc>
-        <w:tc>
-          <w:tcPr>
-            <w:tcW w:type="dxa" w:w="2880"/>
-          </w:tcPr>
-          <w:p>
-            <w:r>
-              <w:t>38K enrollment, HSI designation, Pell %, first-gen %</w:t>
+              <w:t>58%</w:t>
             </w:r>
           </w:p>
         </w:tc>
@@ -192,63 +132,21 @@
       <w:tr>
         <w:tc>
           <w:tcPr>
-            <w:tcW w:type="dxa" w:w="2880"/>
+            <w:tcW w:type="dxa" w:w="4320"/>
           </w:tcPr>
           <w:p>
             <w:r>
-              <w:t>IPEDS / NCES</w:t>
+              <w:t>First-Generation</w:t>
             </w:r>
           </w:p>
         </w:tc>
         <w:tc>
           <w:tcPr>
-            <w:tcW w:type="dxa" w:w="2880"/>
+            <w:tcW w:type="dxa" w:w="4320"/>
           </w:tcPr>
           <w:p>
             <w:r>
-              <w:t>nces.ed.gov/ipeds/</w:t>
-            </w:r>
-          </w:p>
-        </w:tc>
-        <w:tc>
-          <w:tcPr>
-            <w:tcW w:type="dxa" w:w="2880"/>
-          </w:tcPr>
-          <w:p>
-            <w:r>
-              <w:t>Federal enrollment and graduation data</w:t>
-            </w:r>
-          </w:p>
-        </w:tc>
-      </w:tr>
-      <w:tr>
-        <w:tc>
-          <w:tcPr>
-            <w:tcW w:type="dxa" w:w="2880"/>
-          </w:tcPr>
-          <w:p>
-            <w:r>
-              <w:t>US Dept of Education College Scorecard</w:t>
-            </w:r>
-          </w:p>
-        </w:tc>
-        <w:tc>
-          <w:tcPr>
-            <w:tcW w:type="dxa" w:w="2880"/>
-          </w:tcPr>
-          <w:p>
-            <w:r>
-              <w:t>collegescorecard.ed.gov</w:t>
-            </w:r>
-          </w:p>
-        </w:tc>
-        <w:tc>
-          <w:tcPr>
-            <w:tcW w:type="dxa" w:w="2880"/>
-          </w:tcPr>
-          <w:p>
-            <w:r>
-              <w:t>Completion rates, financial aid data</w:t>
+              <w:t>47%</w:t>
             </w:r>
           </w:p>
         </w:tc>
@@ -260,7 +158,137 @@
         <w:pStyle w:val="Heading2"/>
       </w:pPr>
       <w:r>
-        <w:t>What we CANNOT do:</w:t>
+        <w:t>Data Sources</w:t>
+      </w:r>
+    </w:p>
+    <w:tbl>
+      <w:tblPr>
+        <w:tblStyle w:val="LightGrid-Accent1"/>
+        <w:tblW w:type="auto" w:w="0"/>
+        <w:tblLook w:firstColumn="1" w:firstRow="1" w:lastColumn="0" w:lastRow="0" w:noHBand="0" w:noVBand="1" w:val="04A0"/>
+      </w:tblPr>
+      <w:tblGrid>
+        <w:gridCol w:w="4320"/>
+        <w:gridCol w:w="4320"/>
+      </w:tblGrid>
+      <w:tr>
+        <w:tc>
+          <w:tcPr>
+            <w:tcW w:type="dxa" w:w="4320"/>
+          </w:tcPr>
+          <w:p>
+            <w:r>
+              <w:t>Source</w:t>
+            </w:r>
+          </w:p>
+        </w:tc>
+        <w:tc>
+          <w:tcPr>
+            <w:tcW w:type="dxa" w:w="4320"/>
+          </w:tcPr>
+          <w:p>
+            <w:r>
+              <w:t>What We Used</w:t>
+            </w:r>
+          </w:p>
+        </w:tc>
+      </w:tr>
+      <w:tr>
+        <w:tc>
+          <w:tcPr>
+            <w:tcW w:type="dxa" w:w="4320"/>
+          </w:tcPr>
+          <w:p>
+            <w:r>
+              <w:t>CSUN Institutional Research</w:t>
+            </w:r>
+          </w:p>
+        </w:tc>
+        <w:tc>
+          <w:tcPr>
+            <w:tcW w:type="dxa" w:w="4320"/>
+          </w:tcPr>
+          <w:p>
+            <w:r>
+              <w:t>Enrollment demographics, graduation rates, Pell eligibility rates</w:t>
+            </w:r>
+          </w:p>
+        </w:tc>
+      </w:tr>
+      <w:tr>
+        <w:tc>
+          <w:tcPr>
+            <w:tcW w:type="dxa" w:w="4320"/>
+          </w:tcPr>
+          <w:p>
+            <w:r>
+              <w:t>CSUN Fact Sheet</w:t>
+            </w:r>
+          </w:p>
+        </w:tc>
+        <w:tc>
+          <w:tcPr>
+            <w:tcW w:type="dxa" w:w="4320"/>
+          </w:tcPr>
+          <w:p>
+            <w:r>
+              <w:t>Student body composition, first-generation percentages</w:t>
+            </w:r>
+          </w:p>
+        </w:tc>
+      </w:tr>
+      <w:tr>
+        <w:tc>
+          <w:tcPr>
+            <w:tcW w:type="dxa" w:w="4320"/>
+          </w:tcPr>
+          <w:p>
+            <w:r>
+              <w:t>IPEDS (NCES)</w:t>
+            </w:r>
+          </w:p>
+        </w:tc>
+        <w:tc>
+          <w:tcPr>
+            <w:tcW w:type="dxa" w:w="4320"/>
+          </w:tcPr>
+          <w:p>
+            <w:r>
+              <w:t>Federal enrollment and completion data</w:t>
+            </w:r>
+          </w:p>
+        </w:tc>
+      </w:tr>
+      <w:tr>
+        <w:tc>
+          <w:tcPr>
+            <w:tcW w:type="dxa" w:w="4320"/>
+          </w:tcPr>
+          <w:p>
+            <w:r>
+              <w:t>College Scorecard (US DOE)</w:t>
+            </w:r>
+          </w:p>
+        </w:tc>
+        <w:tc>
+          <w:tcPr>
+            <w:tcW w:type="dxa" w:w="4320"/>
+          </w:tcPr>
+          <w:p>
+            <w:r>
+              <w:t>Financial aid rates, income distributions</w:t>
+            </w:r>
+          </w:p>
+        </w:tc>
+      </w:tr>
+    </w:tbl>
+    <w:p/>
+    <w:p>
+      <w:pPr>
+        <w:pStyle w:val="Heading2"/>
+      </w:pPr>
+      <w:r>
+        <w:t>Data Ethics Compliance</w:t>
       </w:r>
     </w:p>
     <w:p>
@@ -268,7 +296,7 @@
         <w:pStyle w:val="ListBullet"/>
       </w:pPr>
       <w:r>
-        <w:t>Upload real student records to any AI platform</w:t>
+        <w:t>No real CSUN student data used -- all synthetic</w:t>
       </w:r>
     </w:p>
     <w:p>
@@ -276,7 +304,7 @@
         <w:pStyle w:val="ListBullet"/>
       </w:pPr>
       <w:r>
-        <w:t>Use any CSUN confidential or sensitive data</w:t>
+        <w:t>No copyrighted data</w:t>
       </w:r>
     </w:p>
     <w:p>
@@ -284,7 +312,7 @@
         <w:pStyle w:val="ListBullet"/>
       </w:pPr>
       <w:r>
-        <w:t>Use copyrighted data or data involving minors</w:t>
+        <w:t>No data involving minors</w:t>
       </w:r>
     </w:p>
     <w:p>
@@ -292,19 +320,23 @@
         <w:pStyle w:val="ListBullet"/>
       </w:pPr>
       <w:r>
-        <w:t>Promote commercial entities</w:t>
+        <w:t>No commercial promotion</w:t>
       </w:r>
     </w:p>
-    <w:p/>
     <w:p>
+      <w:pPr>
+        <w:pStyle w:val="ListBullet"/>
+      </w:pPr>
       <w:r>
-        <w:rPr>
-          <w:b/>
-        </w:rPr>
-        <w:t xml:space="preserve">Our compliance: </w:t>
+        <w:t>Synthetic data disclosure included in both Netlify site and Streamlit app</w:t>
       </w:r>
+    </w:p>
+    <w:p>
+      <w:pPr>
+        <w:pStyle w:val="ListBullet"/>
+      </w:pPr>
       <w:r>
-        <w:t>We are fully compliant. All data is synthetic. We say "synthetic data modeled on public institutional data" whenever we present it. The video script includes an explicit data disclosure at the end.</w:t>
+        <w:t>AI usage disclosure included in both platforms</w:t>
       </w:r>
     </w:p>
     <w:p/>
@@ -316,29 +348,30 @@
         <w:rPr>
           <w:color w:val="CF0A2C"/>
         </w:rPr>
-        <w:t>2. Demo Datasets</w:t>
+        <w:t>Section 2: Demo Datasets</w:t>
       </w:r>
     </w:p>
     <w:p>
       <w:r>
-        <w:t>We currently have one synthetic dataset with 5,000 records. We can create additional datasets to make the demo more compelling:</w:t>
+        <w:t>Three pre-built synthetic datasets are included for demonstration:</w:t>
       </w:r>
     </w:p>
     <w:tbl>
       <w:tblPr>
-        <w:tblStyle w:val="MediumShading1-Accent1"/>
+        <w:tblStyle w:val="LightGrid-Accent1"/>
         <w:tblW w:type="auto" w:w="0"/>
         <w:tblLook w:firstColumn="1" w:firstRow="1" w:lastColumn="0" w:lastRow="0" w:noHBand="0" w:noVBand="1" w:val="04A0"/>
       </w:tblPr>
       <w:tblGrid>
-        <w:gridCol w:w="2880"/>
-        <w:gridCol w:w="2880"/>
-        <w:gridCol w:w="2880"/>
+        <w:gridCol w:w="2160"/>
+        <w:gridCol w:w="2160"/>
+        <w:gridCol w:w="2160"/>
+        <w:gridCol w:w="2160"/>
       </w:tblGrid>
       <w:tr>
         <w:tc>
           <w:tcPr>
-            <w:tcW w:type="dxa" w:w="2880"/>
+            <w:tcW w:type="dxa" w:w="2160"/>
           </w:tcPr>
           <w:p>
             <w:r>
@@ -348,21 +381,31 @@
         </w:tc>
         <w:tc>
           <w:tcPr>
-            <w:tcW w:type="dxa" w:w="2880"/>
+            <w:tcW w:type="dxa" w:w="2160"/>
           </w:tcPr>
           <w:p>
             <w:r>
-              <w:t>What It Shows</w:t>
+              <w:t>Records</w:t>
             </w:r>
           </w:p>
         </w:tc>
         <w:tc>
           <w:tcPr>
-            <w:tcW w:type="dxa" w:w="2880"/>
+            <w:tcW w:type="dxa" w:w="2160"/>
           </w:tcPr>
           <w:p>
             <w:r>
-              <w:t>Why It Matters</w:t>
+              <w:t>Columns</w:t>
+            </w:r>
+          </w:p>
+        </w:tc>
+        <w:tc>
+          <w:tcPr>
+            <w:tcW w:type="dxa" w:w="2160"/>
+          </w:tcPr>
+          <w:p>
+            <w:r>
+              <w:t>Use Case</w:t>
             </w:r>
           </w:p>
         </w:tc>
@@ -370,33 +413,41 @@
       <w:tr>
         <w:tc>
           <w:tcPr>
-            <w:tcW w:type="dxa" w:w="2880"/>
+            <w:tcW w:type="dxa" w:w="2160"/>
           </w:tcPr>
           <w:p>
             <w:r>
-              <w:t>csun_synthetic_students.csv</w:t>
-              <w:br/>
-              <w:t>(current)</w:t>
+              <w:t>csun_financial_aid_synthetic.csv</w:t>
             </w:r>
           </w:p>
         </w:tc>
         <w:tc>
           <w:tcPr>
-            <w:tcW w:type="dxa" w:w="2880"/>
+            <w:tcW w:type="dxa" w:w="2160"/>
           </w:tcPr>
           <w:p>
             <w:r>
-              <w:t>Full 8-audit dataset with moderate biases baked in</w:t>
+              <w:t>5,000</w:t>
             </w:r>
           </w:p>
         </w:tc>
         <w:tc>
           <w:tcPr>
-            <w:tcW w:type="dxa" w:w="2880"/>
+            <w:tcW w:type="dxa" w:w="2160"/>
           </w:tcPr>
           <w:p>
             <w:r>
-              <w:t>Main demo -- shows realistic disparities across financial aid, admissions, STEM recs, plagiarism, etc.</w:t>
+              <w:t>15</w:t>
+            </w:r>
+          </w:p>
+        </w:tc>
+        <w:tc>
+          <w:tcPr>
+            <w:tcW w:type="dxa" w:w="2160"/>
+          </w:tcPr>
+          <w:p>
+            <w:r>
+              <w:t>Financial aid approval audits, proxy detection, What-If Simulator</w:t>
             </w:r>
           </w:p>
         </w:tc>
@@ -404,33 +455,41 @@
       <w:tr>
         <w:tc>
           <w:tcPr>
-            <w:tcW w:type="dxa" w:w="2880"/>
+            <w:tcW w:type="dxa" w:w="2160"/>
           </w:tcPr>
           <w:p>
             <w:r>
-              <w:t>csun_high_bias.csv</w:t>
-              <w:br/>
-              <w:t>(can create)</w:t>
+              <w:t>csun_admissions_synthetic.csv</w:t>
             </w:r>
           </w:p>
         </w:tc>
         <w:tc>
           <w:tcPr>
-            <w:tcW w:type="dxa" w:w="2880"/>
+            <w:tcW w:type="dxa" w:w="2160"/>
           </w:tcPr>
           <w:p>
             <w:r>
-              <w:t>Same demographics but with severe biases</w:t>
+              <w:t>5,000</w:t>
             </w:r>
           </w:p>
         </w:tc>
         <w:tc>
           <w:tcPr>
-            <w:tcW w:type="dxa" w:w="2880"/>
+            <w:tcW w:type="dxa" w:w="2160"/>
           </w:tcPr>
           <w:p>
             <w:r>
-              <w:t>Shows what a FAILING system looks like -- all metrics in the red, dramatic visual impact</w:t>
+              <w:t>12</w:t>
+            </w:r>
+          </w:p>
+        </w:tc>
+        <w:tc>
+          <w:tcPr>
+            <w:tcW w:type="dxa" w:w="2160"/>
+          </w:tcPr>
+          <w:p>
+            <w:r>
+              <w:t>Admissions screening, at-risk flagging, STEM recommendation audits</w:t>
             </w:r>
           </w:p>
         </w:tc>
@@ -438,44 +497,46 @@
       <w:tr>
         <w:tc>
           <w:tcPr>
-            <w:tcW w:type="dxa" w:w="2880"/>
+            <w:tcW w:type="dxa" w:w="2160"/>
           </w:tcPr>
           <w:p>
             <w:r>
-              <w:t>csun_fair.csv</w:t>
-              <w:br/>
-              <w:t>(can create)</w:t>
+              <w:t>csun_advising_synthetic.csv</w:t>
             </w:r>
           </w:p>
         </w:tc>
         <w:tc>
           <w:tcPr>
-            <w:tcW w:type="dxa" w:w="2880"/>
+            <w:tcW w:type="dxa" w:w="2160"/>
           </w:tcPr>
           <w:p>
             <w:r>
-              <w:t>Same demographics but with no biases</w:t>
+              <w:t>5,000</w:t>
             </w:r>
           </w:p>
         </w:tc>
         <w:tc>
           <w:tcPr>
-            <w:tcW w:type="dxa" w:w="2880"/>
+            <w:tcW w:type="dxa" w:w="2160"/>
           </w:tcPr>
           <w:p>
             <w:r>
-              <w:t>Shows what a PASSING audit looks like -- demonstrates that MatadorAudit can confirm fairness too</w:t>
+              <w:t>10</w:t>
+            </w:r>
+          </w:p>
+        </w:tc>
+        <w:tc>
+          <w:tcPr>
+            <w:tcW w:type="dxa" w:w="2160"/>
+          </w:tcPr>
+          <w:p>
+            <w:r>
+              <w:t>Academic advising quality, scholarship allocation, gender parity</w:t>
             </w:r>
           </w:p>
         </w:tc>
       </w:tr>
     </w:tbl>
-    <w:p/>
-    <w:p>
-      <w:r>
-        <w:t>Demo strategy: "Here is a biased system... here is what a fair one looks like... MatadorAudit catches the difference."</w:t>
-      </w:r>
-    </w:p>
     <w:p/>
     <w:p>
       <w:pPr>
@@ -485,19 +546,12 @@
         <w:rPr>
           <w:color w:val="CF0A2C"/>
         </w:rPr>
-        <w:t>3. What AI/API Is Used -- How to Explain It</w:t>
+        <w:t>Section 3: What AI/API Is Used</w:t>
       </w:r>
     </w:p>
     <w:p>
       <w:r>
-        <w:rPr>
-          <w:b/>
-          <w:color w:val="CF0A2C"/>
-        </w:rPr>
-        <w:t xml:space="preserve">KEY MESSAGE: </w:t>
-      </w:r>
-      <w:r>
-        <w:t>"AI is used for communication, not computation. The fairness math is based on established peer-reviewed research. AI makes the results accessible to non-technical users."</w:t>
+        <w:t>MatadorAudit uses AI in two ways: (1) generating natural-language fairness report cards, and (2) powering the AI Q&amp;A Assistant for follow-up questions.</w:t>
       </w:r>
     </w:p>
     <w:p/>
@@ -506,12 +560,12 @@
         <w:pStyle w:val="Heading2"/>
       </w:pPr>
       <w:r>
-        <w:t>Component Breakdown:</w:t>
+        <w:t>AI/API Components</w:t>
       </w:r>
     </w:p>
     <w:tbl>
       <w:tblPr>
-        <w:tblStyle w:val="MediumShading1-Accent1"/>
+        <w:tblStyle w:val="LightGrid-Accent1"/>
         <w:tblW w:type="auto" w:w="0"/>
         <w:tblLook w:firstColumn="1" w:firstRow="1" w:lastColumn="0" w:lastRow="0" w:noHBand="0" w:noVBand="1" w:val="04A0"/>
       </w:tblPr>
@@ -538,7 +592,7 @@
           </w:tcPr>
           <w:p>
             <w:r>
-              <w:t>What Does the Work</w:t>
+              <w:t>Provider / Model</w:t>
             </w:r>
           </w:p>
         </w:tc>
@@ -548,7 +602,7 @@
           </w:tcPr>
           <w:p>
             <w:r>
-              <w:t>Is It AI?</w:t>
+              <w:t>Used in Demo?</w:t>
             </w:r>
           </w:p>
         </w:tc>
@@ -558,7 +612,7 @@
           </w:tcPr>
           <w:p>
             <w:r>
-              <w:t>What to Say</w:t>
+              <w:t>Purpose</w:t>
             </w:r>
           </w:p>
         </w:tc>
@@ -570,9 +624,7 @@
           </w:tcPr>
           <w:p>
             <w:r>
-              <w:t>Fairness metrics</w:t>
-              <w:br/>
-              <w:t>(parity, disparate impact, equalized odds)</w:t>
+              <w:t>Groq Q&amp;A (free, built-in)</w:t>
             </w:r>
           </w:p>
         </w:tc>
@@ -582,7 +634,7 @@
           </w:tcPr>
           <w:p>
             <w:r>
-              <w:t>Our own Python code based on published formulas</w:t>
+              <w:t>Groq API (Llama 3.3 70B)</w:t>
             </w:r>
           </w:p>
         </w:tc>
@@ -592,7 +644,7 @@
           </w:tcPr>
           <w:p>
             <w:r>
-              <w:t>NO</w:t>
+              <w:t>YES</w:t>
             </w:r>
           </w:p>
         </w:tc>
@@ -602,7 +654,7 @@
           </w:tcPr>
           <w:p>
             <w:r>
-              <w:t>"We implemented established fairness metrics from peer-reviewed research -- no AI needed for the math"</w:t>
+              <w:t>Free AI Q&amp;A built into MatadorAudit -- users can ask follow-up questions about their audit with no setup required</w:t>
             </w:r>
           </w:p>
         </w:tc>
@@ -614,53 +666,7 @@
           </w:tcPr>
           <w:p>
             <w:r>
-              <w:t>Proxy detection</w:t>
-              <w:br/>
-              <w:t>(correlation analysis)</w:t>
-            </w:r>
-          </w:p>
-        </w:tc>
-        <w:tc>
-          <w:tcPr>
-            <w:tcW w:type="dxa" w:w="2160"/>
-          </w:tcPr>
-          <w:p>
-            <w:r>
-              <w:t>Our own Python code</w:t>
-              <w:br/>
-              <w:t>(point-biserial correlation)</w:t>
-            </w:r>
-          </w:p>
-        </w:tc>
-        <w:tc>
-          <w:tcPr>
-            <w:tcW w:type="dxa" w:w="2160"/>
-          </w:tcPr>
-          <w:p>
-            <w:r>
-              <w:t>NO</w:t>
-            </w:r>
-          </w:p>
-        </w:tc>
-        <w:tc>
-          <w:tcPr>
-            <w:tcW w:type="dxa" w:w="2160"/>
-          </w:tcPr>
-          <w:p>
-            <w:r>
-              <w:t>"We use statistical correlation analysis to detect proxy variables"</w:t>
-            </w:r>
-          </w:p>
-        </w:tc>
-      </w:tr>
-      <w:tr>
-        <w:tc>
-          <w:tcPr>
-            <w:tcW w:type="dxa" w:w="2160"/>
-          </w:tcPr>
-          <w:p>
-            <w:r>
-              <w:t>Plain-English reports</w:t>
+              <w:t>Claude Fairness Reports</w:t>
             </w:r>
           </w:p>
         </w:tc>
@@ -690,7 +696,7 @@
           </w:tcPr>
           <w:p>
             <w:r>
-              <w:t>"We use Claude AI to translate statistical results into reports any administrator can understand"</w:t>
+              <w:t>Generates plain-English fairness report cards from statistical summaries</w:t>
             </w:r>
           </w:p>
         </w:tc>
@@ -702,7 +708,7 @@
           </w:tcPr>
           <w:p>
             <w:r>
-              <w:t>Follow-up Q&amp;A</w:t>
+              <w:t>Claude Q&amp;A (optional)</w:t>
             </w:r>
           </w:p>
         </w:tc>
@@ -712,9 +718,7 @@
           </w:tcPr>
           <w:p>
             <w:r>
-              <w:t>Microsoft Copilot /</w:t>
-              <w:br/>
-              <w:t>Google Gemini</w:t>
+              <w:t>Anthropic Claude API</w:t>
             </w:r>
           </w:p>
         </w:tc>
@@ -724,7 +728,7 @@
           </w:tcPr>
           <w:p>
             <w:r>
-              <w:t>YES</w:t>
+              <w:t>Optional</w:t>
             </w:r>
           </w:p>
         </w:tc>
@@ -734,7 +738,7 @@
           </w:tcPr>
           <w:p>
             <w:r>
-              <w:t>"Administrators can use Copilot or Gemini to ask follow-up questions about their report"</w:t>
+              <w:t>Alternative AI Q&amp;A provider if user provides their own API key</w:t>
             </w:r>
           </w:p>
         </w:tc>
@@ -746,7 +750,7 @@
           </w:tcPr>
           <w:p>
             <w:r>
-              <w:t>Interactive dashboard</w:t>
+              <w:t>ChatGPT Q&amp;A (optional)</w:t>
             </w:r>
           </w:p>
         </w:tc>
@@ -756,7 +760,7 @@
           </w:tcPr>
           <w:p>
             <w:r>
-              <w:t>Streamlit + Plotly</w:t>
+              <w:t>OpenAI GPT API</w:t>
             </w:r>
           </w:p>
         </w:tc>
@@ -766,7 +770,7 @@
           </w:tcPr>
           <w:p>
             <w:r>
-              <w:t>NO</w:t>
+              <w:t>Optional</w:t>
             </w:r>
           </w:p>
         </w:tc>
@@ -776,49 +780,7 @@
           </w:tcPr>
           <w:p>
             <w:r>
-              <w:t>"Standard data visualization tools -- no AI involved in the charts or interface"</w:t>
-            </w:r>
-          </w:p>
-        </w:tc>
-      </w:tr>
-    </w:tbl>
-    <w:p/>
-    <w:p>
-      <w:pPr>
-        <w:pStyle w:val="Heading2"/>
-      </w:pPr>
-      <w:r>
-        <w:t>Academic Sources for Our Metrics:</w:t>
-      </w:r>
-    </w:p>
-    <w:tbl>
-      <w:tblPr>
-        <w:tblStyle w:val="MediumShading1-Accent1"/>
-        <w:tblW w:type="auto" w:w="0"/>
-        <w:tblLook w:firstColumn="1" w:firstRow="1" w:lastColumn="0" w:lastRow="0" w:noHBand="0" w:noVBand="1" w:val="04A0"/>
-      </w:tblPr>
-      <w:tblGrid>
-        <w:gridCol w:w="4320"/>
-        <w:gridCol w:w="4320"/>
-      </w:tblGrid>
-      <w:tr>
-        <w:tc>
-          <w:tcPr>
-            <w:tcW w:type="dxa" w:w="4320"/>
-          </w:tcPr>
-          <w:p>
-            <w:r>
-              <w:t>Metric</w:t>
-            </w:r>
-          </w:p>
-        </w:tc>
-        <w:tc>
-          <w:tcPr>
-            <w:tcW w:type="dxa" w:w="4320"/>
-          </w:tcPr>
-          <w:p>
-            <w:r>
-              <w:t>Source</w:t>
+              <w:t>Alternative AI Q&amp;A provider if user provides their own API key</w:t>
             </w:r>
           </w:p>
         </w:tc>
@@ -826,21 +788,41 @@
       <w:tr>
         <w:tc>
           <w:tcPr>
-            <w:tcW w:type="dxa" w:w="4320"/>
+            <w:tcW w:type="dxa" w:w="2160"/>
           </w:tcPr>
           <w:p>
             <w:r>
-              <w:t>Demographic Parity</w:t>
+              <w:t>Gemini Q&amp;A (optional)</w:t>
             </w:r>
           </w:p>
         </w:tc>
         <w:tc>
           <w:tcPr>
-            <w:tcW w:type="dxa" w:w="4320"/>
+            <w:tcW w:type="dxa" w:w="2160"/>
           </w:tcPr>
           <w:p>
             <w:r>
-              <w:t>Dwork et al., "Fairness through Awareness," ITCS 2012</w:t>
+              <w:t>Google Gemini API</w:t>
+            </w:r>
+          </w:p>
+        </w:tc>
+        <w:tc>
+          <w:tcPr>
+            <w:tcW w:type="dxa" w:w="2160"/>
+          </w:tcPr>
+          <w:p>
+            <w:r>
+              <w:t>Optional</w:t>
+            </w:r>
+          </w:p>
+        </w:tc>
+        <w:tc>
+          <w:tcPr>
+            <w:tcW w:type="dxa" w:w="2160"/>
+          </w:tcPr>
+          <w:p>
+            <w:r>
+              <w:t>Alternative AI Q&amp;A provider if user provides their own API key</w:t>
             </w:r>
           </w:p>
         </w:tc>
@@ -848,21 +830,41 @@
       <w:tr>
         <w:tc>
           <w:tcPr>
-            <w:tcW w:type="dxa" w:w="4320"/>
+            <w:tcW w:type="dxa" w:w="2160"/>
           </w:tcPr>
           <w:p>
             <w:r>
-              <w:t>Disparate Impact (Four-Fifths Rule)</w:t>
+              <w:t>Ollama Q&amp;A (optional)</w:t>
             </w:r>
           </w:p>
         </w:tc>
         <w:tc>
           <w:tcPr>
-            <w:tcW w:type="dxa" w:w="4320"/>
+            <w:tcW w:type="dxa" w:w="2160"/>
           </w:tcPr>
           <w:p>
             <w:r>
-              <w:t>EEOC Uniform Guidelines, 29 C.F.R. Part 1607 (1978); Griggs v. Duke Power Co., 401 U.S. 424 (1971)</w:t>
+              <w:t>Ollama (local models)</w:t>
+            </w:r>
+          </w:p>
+        </w:tc>
+        <w:tc>
+          <w:tcPr>
+            <w:tcW w:type="dxa" w:w="2160"/>
+          </w:tcPr>
+          <w:p>
+            <w:r>
+              <w:t>Optional</w:t>
+            </w:r>
+          </w:p>
+        </w:tc>
+        <w:tc>
+          <w:tcPr>
+            <w:tcW w:type="dxa" w:w="2160"/>
+          </w:tcPr>
+          <w:p>
+            <w:r>
+              <w:t>Local AI Q&amp;A for users who want to run models on their own machine</w:t>
             </w:r>
           </w:p>
         </w:tc>
@@ -870,65 +872,41 @@
       <w:tr>
         <w:tc>
           <w:tcPr>
-            <w:tcW w:type="dxa" w:w="4320"/>
+            <w:tcW w:type="dxa" w:w="2160"/>
           </w:tcPr>
           <w:p>
             <w:r>
-              <w:t>Equalized Odds</w:t>
+              <w:t>Copilot mode (optional)</w:t>
             </w:r>
           </w:p>
         </w:tc>
         <w:tc>
           <w:tcPr>
-            <w:tcW w:type="dxa" w:w="4320"/>
+            <w:tcW w:type="dxa" w:w="2160"/>
           </w:tcPr>
           <w:p>
             <w:r>
-              <w:t>Hardt, Price &amp; Srebro, "Equality of Opportunity in Supervised Learning," NeurIPS 2016</w:t>
-            </w:r>
-          </w:p>
-        </w:tc>
-      </w:tr>
-      <w:tr>
-        <w:tc>
-          <w:tcPr>
-            <w:tcW w:type="dxa" w:w="4320"/>
-          </w:tcPr>
-          <w:p>
-            <w:r>
-              <w:t>Proxy Discrimination</w:t>
+              <w:t>Copy-paste to any AI</w:t>
             </w:r>
           </w:p>
         </w:tc>
         <w:tc>
           <w:tcPr>
-            <w:tcW w:type="dxa" w:w="4320"/>
+            <w:tcW w:type="dxa" w:w="2160"/>
           </w:tcPr>
           <w:p>
             <w:r>
-              <w:t>Datta, Tschantz &amp; Datta, "Automated Experiments on Ad Privacy Settings," PoPETs 2015</w:t>
-            </w:r>
-          </w:p>
-        </w:tc>
-      </w:tr>
-      <w:tr>
-        <w:tc>
-          <w:tcPr>
-            <w:tcW w:type="dxa" w:w="4320"/>
-          </w:tcPr>
-          <w:p>
-            <w:r>
-              <w:t>Impossibility Theorem</w:t>
+              <w:t>Optional</w:t>
             </w:r>
           </w:p>
         </w:tc>
         <w:tc>
           <w:tcPr>
-            <w:tcW w:type="dxa" w:w="4320"/>
+            <w:tcW w:type="dxa" w:w="2160"/>
           </w:tcPr>
           <w:p>
             <w:r>
-              <w:t>Chouldechova, "Fair Prediction with Disparate Impact," Big Data 5(2), 2017</w:t>
+              <w:t>Copies audit context to clipboard so users can paste into any AI assistant</w:t>
             </w:r>
           </w:p>
         </w:tc>
@@ -943,9 +921,263 @@
         <w:t xml:space="preserve">Note: </w:t>
       </w:r>
       <w:r>
-        <w:t>The video script (Section 2, timestamp 0:50-2:00) already covers all of this. Both team members should be prepared to explain the AI vs. non-AI distinction if judges ask follow-up questions.</w:t>
+        <w:t>Groq is the default free option that works out of the box with no user setup. Claude, ChatGPT, Gemini, and Ollama are optional alternatives that users can configure if they prefer a different AI provider.</w:t>
       </w:r>
     </w:p>
+    <w:p/>
+    <w:p>
+      <w:pPr>
+        <w:pStyle w:val="Heading2"/>
+      </w:pPr>
+      <w:r>
+        <w:t>What AI Does NOT Do</w:t>
+      </w:r>
+    </w:p>
+    <w:p>
+      <w:pPr>
+        <w:pStyle w:val="ListBullet"/>
+      </w:pPr>
+      <w:r>
+        <w:t>AI never receives raw student data -- only statistical summaries</w:t>
+      </w:r>
+    </w:p>
+    <w:p>
+      <w:pPr>
+        <w:pStyle w:val="ListBullet"/>
+      </w:pPr>
+      <w:r>
+        <w:t>AI does not make decisions or automatically debias systems</w:t>
+      </w:r>
+    </w:p>
+    <w:p>
+      <w:pPr>
+        <w:pStyle w:val="ListBullet"/>
+      </w:pPr>
+      <w:r>
+        <w:t>AI does not access any real CSUN systems or databases</w:t>
+      </w:r>
+    </w:p>
+    <w:p>
+      <w:pPr>
+        <w:pStyle w:val="ListBullet"/>
+      </w:pPr>
+      <w:r>
+        <w:t>All fairness metrics are computed locally using our own code -- AI is used only for natural-language explanations and Q&amp;A</w:t>
+      </w:r>
+    </w:p>
+    <w:p/>
+    <w:p>
+      <w:pPr>
+        <w:pStyle w:val="Heading2"/>
+      </w:pPr>
+      <w:r>
+        <w:t>Academic Sources for Fairness Metrics</w:t>
+      </w:r>
+    </w:p>
+    <w:tbl>
+      <w:tblPr>
+        <w:tblStyle w:val="LightGrid-Accent1"/>
+        <w:tblW w:type="auto" w:w="0"/>
+        <w:tblLook w:firstColumn="1" w:firstRow="1" w:lastColumn="0" w:lastRow="0" w:noHBand="0" w:noVBand="1" w:val="04A0"/>
+      </w:tblPr>
+      <w:tblGrid>
+        <w:gridCol w:w="2880"/>
+        <w:gridCol w:w="2880"/>
+        <w:gridCol w:w="2880"/>
+      </w:tblGrid>
+      <w:tr>
+        <w:tc>
+          <w:tcPr>
+            <w:tcW w:type="dxa" w:w="2880"/>
+          </w:tcPr>
+          <w:p>
+            <w:r>
+              <w:t>Citation</w:t>
+            </w:r>
+          </w:p>
+        </w:tc>
+        <w:tc>
+          <w:tcPr>
+            <w:tcW w:type="dxa" w:w="2880"/>
+          </w:tcPr>
+          <w:p>
+            <w:r>
+              <w:t>Concept</w:t>
+            </w:r>
+          </w:p>
+        </w:tc>
+        <w:tc>
+          <w:tcPr>
+            <w:tcW w:type="dxa" w:w="2880"/>
+          </w:tcPr>
+          <w:p>
+            <w:r>
+              <w:t>How We Use It</w:t>
+            </w:r>
+          </w:p>
+        </w:tc>
+      </w:tr>
+      <w:tr>
+        <w:tc>
+          <w:tcPr>
+            <w:tcW w:type="dxa" w:w="2880"/>
+          </w:tcPr>
+          <w:p>
+            <w:r>
+              <w:t>Dwork et al., 2012</w:t>
+            </w:r>
+          </w:p>
+        </w:tc>
+        <w:tc>
+          <w:tcPr>
+            <w:tcW w:type="dxa" w:w="2880"/>
+          </w:tcPr>
+          <w:p>
+            <w:r>
+              <w:t>Individual Fairness</w:t>
+            </w:r>
+          </w:p>
+        </w:tc>
+        <w:tc>
+          <w:tcPr>
+            <w:tcW w:type="dxa" w:w="2880"/>
+          </w:tcPr>
+          <w:p>
+            <w:r>
+              <w:t>Framework for treating similar individuals similarly</w:t>
+            </w:r>
+          </w:p>
+        </w:tc>
+      </w:tr>
+      <w:tr>
+        <w:tc>
+          <w:tcPr>
+            <w:tcW w:type="dxa" w:w="2880"/>
+          </w:tcPr>
+          <w:p>
+            <w:r>
+              <w:t>EEOC, 1978</w:t>
+            </w:r>
+          </w:p>
+        </w:tc>
+        <w:tc>
+          <w:tcPr>
+            <w:tcW w:type="dxa" w:w="2880"/>
+          </w:tcPr>
+          <w:p>
+            <w:r>
+              <w:t>Four-Fifths Rule (Disparate Impact)</w:t>
+            </w:r>
+          </w:p>
+        </w:tc>
+        <w:tc>
+          <w:tcPr>
+            <w:tcW w:type="dxa" w:w="2880"/>
+          </w:tcPr>
+          <w:p>
+            <w:r>
+              <w:t>Threshold for disparate impact ratio (0.80)</w:t>
+            </w:r>
+          </w:p>
+        </w:tc>
+      </w:tr>
+      <w:tr>
+        <w:tc>
+          <w:tcPr>
+            <w:tcW w:type="dxa" w:w="2880"/>
+          </w:tcPr>
+          <w:p>
+            <w:r>
+              <w:t>Hardt et al., 2016</w:t>
+            </w:r>
+          </w:p>
+        </w:tc>
+        <w:tc>
+          <w:tcPr>
+            <w:tcW w:type="dxa" w:w="2880"/>
+          </w:tcPr>
+          <w:p>
+            <w:r>
+              <w:t>Equalized Odds</w:t>
+            </w:r>
+          </w:p>
+        </w:tc>
+        <w:tc>
+          <w:tcPr>
+            <w:tcW w:type="dxa" w:w="2880"/>
+          </w:tcPr>
+          <w:p>
+            <w:r>
+              <w:t>Equal true positive and false positive rates across groups</w:t>
+            </w:r>
+          </w:p>
+        </w:tc>
+      </w:tr>
+      <w:tr>
+        <w:tc>
+          <w:tcPr>
+            <w:tcW w:type="dxa" w:w="2880"/>
+          </w:tcPr>
+          <w:p>
+            <w:r>
+              <w:t>Datta et al., 2015</w:t>
+            </w:r>
+          </w:p>
+        </w:tc>
+        <w:tc>
+          <w:tcPr>
+            <w:tcW w:type="dxa" w:w="2880"/>
+          </w:tcPr>
+          <w:p>
+            <w:r>
+              <w:t>Proxy Discrimination</w:t>
+            </w:r>
+          </w:p>
+        </w:tc>
+        <w:tc>
+          <w:tcPr>
+            <w:tcW w:type="dxa" w:w="2880"/>
+          </w:tcPr>
+          <w:p>
+            <w:r>
+              <w:t>Detecting indirect discrimination through correlated variables</w:t>
+            </w:r>
+          </w:p>
+        </w:tc>
+      </w:tr>
+      <w:tr>
+        <w:tc>
+          <w:tcPr>
+            <w:tcW w:type="dxa" w:w="2880"/>
+          </w:tcPr>
+          <w:p>
+            <w:r>
+              <w:t>Chouldechova, 2017</w:t>
+            </w:r>
+          </w:p>
+        </w:tc>
+        <w:tc>
+          <w:tcPr>
+            <w:tcW w:type="dxa" w:w="2880"/>
+          </w:tcPr>
+          <w:p>
+            <w:r>
+              <w:t>Fairness Metric Incompatibility</w:t>
+            </w:r>
+          </w:p>
+        </w:tc>
+        <w:tc>
+          <w:tcPr>
+            <w:tcW w:type="dxa" w:w="2880"/>
+          </w:tcPr>
+          <w:p>
+            <w:r>
+              <w:t>Why multiple metrics cannot be satisfied simultaneously</w:t>
+            </w:r>
+          </w:p>
+        </w:tc>
+      </w:tr>
+    </w:tbl>
     <w:sectPr>
       <w:pgSz w:w="12240" w:h="15840"/>
       <w:pgMar w:top="1440" w:right="1800" w:bottom="1440" w:left="1800" w:header="720" w:footer="720" w:gutter="0"/>

</xml_diff>

<commit_message>
Final documentation update — all files match the shipped product
- Video script: confirmed up to date (OpenRouter, 8 audits, 3 datasets, Zach intro only)
- Video script .docx: regenerated
- Team reference guide .docx: regenerated with OpenRouter, no Groq/Ollama
- Proposal: fixed demographics to 56.2%/58%/47%, replaced Fairlearn/AIF360 with own engine, OpenRouter as default Q&A
- README: added Live Sites, expanded features, updated tech stack
</commit_message>
<xml_diff>
--- a/docs/team_reference_guide.docx
+++ b/docs/team_reference_guide.docx
@@ -19,7 +19,7 @@
         <w:rPr>
           <w:b/>
         </w:rPr>
-        <w:t>Quick-reference for data rules, demo datasets, and AI/API components</w:t>
+        <w:t>Ido Cohen &amp; Zach Bar | CSUN AI Jam 2026 | AI and Ethics Track</w:t>
       </w:r>
     </w:p>
     <w:p/>
@@ -36,122 +36,9 @@
     </w:p>
     <w:p>
       <w:r>
-        <w:t>All data used in MatadorAudit is synthetic. No real CSUN student records were accessed, uploaded, or shared with any AI platform.</w:t>
+        <w:t>All data used in MatadorAudit is synthetic. No real CSUN student data was accessed, uploaded, or shared with any AI platform.</w:t>
       </w:r>
     </w:p>
-    <w:p/>
-    <w:p>
-      <w:pPr>
-        <w:pStyle w:val="Heading2"/>
-      </w:pPr>
-      <w:r>
-        <w:t>Synthetic Data Demographics (modeled on public CSUN data)</w:t>
-      </w:r>
-    </w:p>
-    <w:p>
-      <w:r>
-        <w:t>The synthetic dataset reflects real CSUN demographic proportions from publicly available sources:</w:t>
-      </w:r>
-    </w:p>
-    <w:tbl>
-      <w:tblPr>
-        <w:tblStyle w:val="LightGrid-Accent1"/>
-        <w:tblW w:type="auto" w:w="0"/>
-        <w:tblLook w:firstColumn="1" w:firstRow="1" w:lastColumn="0" w:lastRow="0" w:noHBand="0" w:noVBand="1" w:val="04A0"/>
-      </w:tblPr>
-      <w:tblGrid>
-        <w:gridCol w:w="4320"/>
-        <w:gridCol w:w="4320"/>
-      </w:tblGrid>
-      <w:tr>
-        <w:tc>
-          <w:tcPr>
-            <w:tcW w:type="dxa" w:w="4320"/>
-          </w:tcPr>
-          <w:p>
-            <w:r>
-              <w:t>Demographic</w:t>
-            </w:r>
-          </w:p>
-        </w:tc>
-        <w:tc>
-          <w:tcPr>
-            <w:tcW w:type="dxa" w:w="4320"/>
-          </w:tcPr>
-          <w:p>
-            <w:r>
-              <w:t>Proportion</w:t>
-            </w:r>
-          </w:p>
-        </w:tc>
-      </w:tr>
-      <w:tr>
-        <w:tc>
-          <w:tcPr>
-            <w:tcW w:type="dxa" w:w="4320"/>
-          </w:tcPr>
-          <w:p>
-            <w:r>
-              <w:t>Hispanic/Latino</w:t>
-            </w:r>
-          </w:p>
-        </w:tc>
-        <w:tc>
-          <w:tcPr>
-            <w:tcW w:type="dxa" w:w="4320"/>
-          </w:tcPr>
-          <w:p>
-            <w:r>
-              <w:t>56.2%</w:t>
-            </w:r>
-          </w:p>
-        </w:tc>
-      </w:tr>
-      <w:tr>
-        <w:tc>
-          <w:tcPr>
-            <w:tcW w:type="dxa" w:w="4320"/>
-          </w:tcPr>
-          <w:p>
-            <w:r>
-              <w:t>Pell-Eligible</w:t>
-            </w:r>
-          </w:p>
-        </w:tc>
-        <w:tc>
-          <w:tcPr>
-            <w:tcW w:type="dxa" w:w="4320"/>
-          </w:tcPr>
-          <w:p>
-            <w:r>
-              <w:t>58%</w:t>
-            </w:r>
-          </w:p>
-        </w:tc>
-      </w:tr>
-      <w:tr>
-        <w:tc>
-          <w:tcPr>
-            <w:tcW w:type="dxa" w:w="4320"/>
-          </w:tcPr>
-          <w:p>
-            <w:r>
-              <w:t>First-Generation</w:t>
-            </w:r>
-          </w:p>
-        </w:tc>
-        <w:tc>
-          <w:tcPr>
-            <w:tcW w:type="dxa" w:w="4320"/>
-          </w:tcPr>
-          <w:p>
-            <w:r>
-              <w:t>47%</w:t>
-            </w:r>
-          </w:p>
-        </w:tc>
-      </w:tr>
-    </w:tbl>
     <w:p/>
     <w:p>
       <w:pPr>
@@ -161,134 +48,12 @@
         <w:t>Data Sources</w:t>
       </w:r>
     </w:p>
-    <w:tbl>
-      <w:tblPr>
-        <w:tblStyle w:val="LightGrid-Accent1"/>
-        <w:tblW w:type="auto" w:w="0"/>
-        <w:tblLook w:firstColumn="1" w:firstRow="1" w:lastColumn="0" w:lastRow="0" w:noHBand="0" w:noVBand="1" w:val="04A0"/>
-      </w:tblPr>
-      <w:tblGrid>
-        <w:gridCol w:w="4320"/>
-        <w:gridCol w:w="4320"/>
-      </w:tblGrid>
-      <w:tr>
-        <w:tc>
-          <w:tcPr>
-            <w:tcW w:type="dxa" w:w="4320"/>
-          </w:tcPr>
-          <w:p>
-            <w:r>
-              <w:t>Source</w:t>
-            </w:r>
-          </w:p>
-        </w:tc>
-        <w:tc>
-          <w:tcPr>
-            <w:tcW w:type="dxa" w:w="4320"/>
-          </w:tcPr>
-          <w:p>
-            <w:r>
-              <w:t>What We Used</w:t>
-            </w:r>
-          </w:p>
-        </w:tc>
-      </w:tr>
-      <w:tr>
-        <w:tc>
-          <w:tcPr>
-            <w:tcW w:type="dxa" w:w="4320"/>
-          </w:tcPr>
-          <w:p>
-            <w:r>
-              <w:t>CSUN Institutional Research</w:t>
-            </w:r>
-          </w:p>
-        </w:tc>
-        <w:tc>
-          <w:tcPr>
-            <w:tcW w:type="dxa" w:w="4320"/>
-          </w:tcPr>
-          <w:p>
-            <w:r>
-              <w:t>Enrollment demographics, graduation rates, Pell eligibility rates</w:t>
-            </w:r>
-          </w:p>
-        </w:tc>
-      </w:tr>
-      <w:tr>
-        <w:tc>
-          <w:tcPr>
-            <w:tcW w:type="dxa" w:w="4320"/>
-          </w:tcPr>
-          <w:p>
-            <w:r>
-              <w:t>CSUN Fact Sheet</w:t>
-            </w:r>
-          </w:p>
-        </w:tc>
-        <w:tc>
-          <w:tcPr>
-            <w:tcW w:type="dxa" w:w="4320"/>
-          </w:tcPr>
-          <w:p>
-            <w:r>
-              <w:t>Student body composition, first-generation percentages</w:t>
-            </w:r>
-          </w:p>
-        </w:tc>
-      </w:tr>
-      <w:tr>
-        <w:tc>
-          <w:tcPr>
-            <w:tcW w:type="dxa" w:w="4320"/>
-          </w:tcPr>
-          <w:p>
-            <w:r>
-              <w:t>IPEDS (NCES)</w:t>
-            </w:r>
-          </w:p>
-        </w:tc>
-        <w:tc>
-          <w:tcPr>
-            <w:tcW w:type="dxa" w:w="4320"/>
-          </w:tcPr>
-          <w:p>
-            <w:r>
-              <w:t>Federal enrollment and completion data</w:t>
-            </w:r>
-          </w:p>
-        </w:tc>
-      </w:tr>
-      <w:tr>
-        <w:tc>
-          <w:tcPr>
-            <w:tcW w:type="dxa" w:w="4320"/>
-          </w:tcPr>
-          <w:p>
-            <w:r>
-              <w:t>College Scorecard (US DOE)</w:t>
-            </w:r>
-          </w:p>
-        </w:tc>
-        <w:tc>
-          <w:tcPr>
-            <w:tcW w:type="dxa" w:w="4320"/>
-          </w:tcPr>
-          <w:p>
-            <w:r>
-              <w:t>Financial aid rates, income distributions</w:t>
-            </w:r>
-          </w:p>
-        </w:tc>
-      </w:tr>
-    </w:tbl>
-    <w:p/>
     <w:p>
       <w:pPr>
-        <w:pStyle w:val="Heading2"/>
+        <w:pStyle w:val="ListBullet"/>
       </w:pPr>
       <w:r>
-        <w:t>Data Ethics Compliance</w:t>
+        <w:t>CSUN Institutional Research (csun.edu/counts/demographic.php)</w:t>
       </w:r>
     </w:p>
     <w:p>
@@ -296,7 +61,7 @@
         <w:pStyle w:val="ListBullet"/>
       </w:pPr>
       <w:r>
-        <w:t>No real CSUN student data used -- all synthetic</w:t>
+        <w:t>CSUN Fact Sheet (csun.edu/about/facts)</w:t>
       </w:r>
     </w:p>
     <w:p>
@@ -304,7 +69,7 @@
         <w:pStyle w:val="ListBullet"/>
       </w:pPr>
       <w:r>
-        <w:t>No copyrighted data</w:t>
+        <w:t>IPEDS / NCES (nces.ed.gov/ipeds/)</w:t>
       </w:r>
     </w:p>
     <w:p>
@@ -312,7 +77,15 @@
         <w:pStyle w:val="ListBullet"/>
       </w:pPr>
       <w:r>
-        <w:t>No data involving minors</w:t>
+        <w:t>US Department of Education College Scorecard (collegescorecard.ed.gov)</w:t>
+      </w:r>
+    </w:p>
+    <w:p>
+      <w:pPr>
+        <w:pStyle w:val="Heading2"/>
+      </w:pPr>
+      <w:r>
+        <w:t>CSUN Demographics (used in synthetic data)</w:t>
       </w:r>
     </w:p>
     <w:p>
@@ -320,7 +93,7 @@
         <w:pStyle w:val="ListBullet"/>
       </w:pPr>
       <w:r>
-        <w:t>No commercial promotion</w:t>
+        <w:t>56.2% Hispanic/Latino</w:t>
       </w:r>
     </w:p>
     <w:p>
@@ -328,7 +101,7 @@
         <w:pStyle w:val="ListBullet"/>
       </w:pPr>
       <w:r>
-        <w:t>Synthetic data disclosure included in both Netlify site and Streamlit app</w:t>
+        <w:t>58% Pell Grant-eligible</w:t>
       </w:r>
     </w:p>
     <w:p>
@@ -336,7 +109,15 @@
         <w:pStyle w:val="ListBullet"/>
       </w:pPr>
       <w:r>
-        <w:t>AI usage disclosure included in both platforms</w:t>
+        <w:t>47% first-generation college students</w:t>
+      </w:r>
+    </w:p>
+    <w:p>
+      <w:pPr>
+        <w:pStyle w:val="ListBullet"/>
+      </w:pPr>
+      <w:r>
+        <w:t>~38,000 enrolled students</w:t>
       </w:r>
     </w:p>
     <w:p/>
@@ -353,190 +134,55 @@
     </w:p>
     <w:p>
       <w:r>
-        <w:t>Three pre-built synthetic datasets are included for demonstration:</w:t>
+        <w:t>MatadorAudit includes three pre-built demo datasets for demonstration and testing:</w:t>
       </w:r>
     </w:p>
-    <w:tbl>
-      <w:tblPr>
-        <w:tblStyle w:val="LightGrid-Accent1"/>
-        <w:tblW w:type="auto" w:w="0"/>
-        <w:tblLook w:firstColumn="1" w:firstRow="1" w:lastColumn="0" w:lastRow="0" w:noHBand="0" w:noVBand="1" w:val="04A0"/>
-      </w:tblPr>
-      <w:tblGrid>
-        <w:gridCol w:w="2160"/>
-        <w:gridCol w:w="2160"/>
-        <w:gridCol w:w="2160"/>
-        <w:gridCol w:w="2160"/>
-      </w:tblGrid>
-      <w:tr>
-        <w:tc>
-          <w:tcPr>
-            <w:tcW w:type="dxa" w:w="2160"/>
-          </w:tcPr>
-          <w:p>
-            <w:r>
-              <w:t>Dataset</w:t>
-            </w:r>
-          </w:p>
-        </w:tc>
-        <w:tc>
-          <w:tcPr>
-            <w:tcW w:type="dxa" w:w="2160"/>
-          </w:tcPr>
-          <w:p>
-            <w:r>
-              <w:t>Records</w:t>
-            </w:r>
-          </w:p>
-        </w:tc>
-        <w:tc>
-          <w:tcPr>
-            <w:tcW w:type="dxa" w:w="2160"/>
-          </w:tcPr>
-          <w:p>
-            <w:r>
-              <w:t>Columns</w:t>
-            </w:r>
-          </w:p>
-        </w:tc>
-        <w:tc>
-          <w:tcPr>
-            <w:tcW w:type="dxa" w:w="2160"/>
-          </w:tcPr>
-          <w:p>
-            <w:r>
-              <w:t>Use Case</w:t>
-            </w:r>
-          </w:p>
-        </w:tc>
-      </w:tr>
-      <w:tr>
-        <w:tc>
-          <w:tcPr>
-            <w:tcW w:type="dxa" w:w="2160"/>
-          </w:tcPr>
-          <w:p>
-            <w:r>
-              <w:t>csun_financial_aid_synthetic.csv</w:t>
-            </w:r>
-          </w:p>
-        </w:tc>
-        <w:tc>
-          <w:tcPr>
-            <w:tcW w:type="dxa" w:w="2160"/>
-          </w:tcPr>
-          <w:p>
-            <w:r>
-              <w:t>5,000</w:t>
-            </w:r>
-          </w:p>
-        </w:tc>
-        <w:tc>
-          <w:tcPr>
-            <w:tcW w:type="dxa" w:w="2160"/>
-          </w:tcPr>
-          <w:p>
-            <w:r>
-              <w:t>15</w:t>
-            </w:r>
-          </w:p>
-        </w:tc>
-        <w:tc>
-          <w:tcPr>
-            <w:tcW w:type="dxa" w:w="2160"/>
-          </w:tcPr>
-          <w:p>
-            <w:r>
-              <w:t>Financial aid approval audits, proxy detection, What-If Simulator</w:t>
-            </w:r>
-          </w:p>
-        </w:tc>
-      </w:tr>
-      <w:tr>
-        <w:tc>
-          <w:tcPr>
-            <w:tcW w:type="dxa" w:w="2160"/>
-          </w:tcPr>
-          <w:p>
-            <w:r>
-              <w:t>csun_admissions_synthetic.csv</w:t>
-            </w:r>
-          </w:p>
-        </w:tc>
-        <w:tc>
-          <w:tcPr>
-            <w:tcW w:type="dxa" w:w="2160"/>
-          </w:tcPr>
-          <w:p>
-            <w:r>
-              <w:t>5,000</w:t>
-            </w:r>
-          </w:p>
-        </w:tc>
-        <w:tc>
-          <w:tcPr>
-            <w:tcW w:type="dxa" w:w="2160"/>
-          </w:tcPr>
-          <w:p>
-            <w:r>
-              <w:t>12</w:t>
-            </w:r>
-          </w:p>
-        </w:tc>
-        <w:tc>
-          <w:tcPr>
-            <w:tcW w:type="dxa" w:w="2160"/>
-          </w:tcPr>
-          <w:p>
-            <w:r>
-              <w:t>Admissions screening, at-risk flagging, STEM recommendation audits</w:t>
-            </w:r>
-          </w:p>
-        </w:tc>
-      </w:tr>
-      <w:tr>
-        <w:tc>
-          <w:tcPr>
-            <w:tcW w:type="dxa" w:w="2160"/>
-          </w:tcPr>
-          <w:p>
-            <w:r>
-              <w:t>csun_advising_synthetic.csv</w:t>
-            </w:r>
-          </w:p>
-        </w:tc>
-        <w:tc>
-          <w:tcPr>
-            <w:tcW w:type="dxa" w:w="2160"/>
-          </w:tcPr>
-          <w:p>
-            <w:r>
-              <w:t>5,000</w:t>
-            </w:r>
-          </w:p>
-        </w:tc>
-        <w:tc>
-          <w:tcPr>
-            <w:tcW w:type="dxa" w:w="2160"/>
-          </w:tcPr>
-          <w:p>
-            <w:r>
-              <w:t>10</w:t>
-            </w:r>
-          </w:p>
-        </w:tc>
-        <w:tc>
-          <w:tcPr>
-            <w:tcW w:type="dxa" w:w="2160"/>
-          </w:tcPr>
-          <w:p>
-            <w:r>
-              <w:t>Academic advising quality, scholarship allocation, gender parity</w:t>
-            </w:r>
-          </w:p>
-        </w:tc>
-      </w:tr>
-    </w:tbl>
+    <w:p/>
+    <w:p>
+      <w:pPr>
+        <w:pStyle w:val="Heading2"/>
+      </w:pPr>
+      <w:r>
+        <w:t>1. CSUN Standard Demo</w:t>
+      </w:r>
+    </w:p>
+    <w:p>
+      <w:r>
+        <w:t>5,000 synthetic student records modeled on real CSUN demographics. Reflects typical institutional patterns with moderate disparities across financial aid, admissions, and course recommendations.</w:t>
+      </w:r>
+    </w:p>
+    <w:p>
+      <w:pPr>
+        <w:pStyle w:val="Heading2"/>
+      </w:pPr>
+      <w:r>
+        <w:t>2. High Bias Demo</w:t>
+      </w:r>
+    </w:p>
+    <w:p>
+      <w:r>
+        <w:t>5,000 records with exaggerated demographic disparities. Designed to clearly demonstrate how MatadorAudit detects and visualizes significant fairness gaps. Useful for training and presentations.</w:t>
+      </w:r>
+    </w:p>
+    <w:p>
+      <w:pPr>
+        <w:pStyle w:val="Heading2"/>
+      </w:pPr>
+      <w:r>
+        <w:t>3. Fair Demo</w:t>
+      </w:r>
+    </w:p>
+    <w:p>
+      <w:r>
+        <w:t>5,000 records with minimal demographic disparities. Shows what equitable outcomes look like across all audit scenarios. Useful as a baseline comparison.</w:t>
+      </w:r>
+    </w:p>
+    <w:p/>
+    <w:p>
+      <w:r>
+        <w:t>Users can also upload their own CSV files for custom analysis.</w:t>
+      </w:r>
+    </w:p>
     <w:p/>
     <w:p>
       <w:pPr>
@@ -546,391 +192,54 @@
         <w:rPr>
           <w:color w:val="CF0A2C"/>
         </w:rPr>
-        <w:t>Section 3: What AI/API Is Used</w:t>
+        <w:t>Section 3: AI &amp; API Components</w:t>
       </w:r>
     </w:p>
-    <w:p>
-      <w:r>
-        <w:t>MatadorAudit uses AI in two ways: (1) generating natural-language fairness report cards, and (2) powering the AI Q&amp;A Assistant for follow-up questions.</w:t>
-      </w:r>
-    </w:p>
-    <w:p/>
     <w:p>
       <w:pPr>
         <w:pStyle w:val="Heading2"/>
       </w:pPr>
       <w:r>
-        <w:t>AI/API Components</w:t>
+        <w:t>Fairness Metrics Engine</w:t>
       </w:r>
     </w:p>
-    <w:tbl>
-      <w:tblPr>
-        <w:tblStyle w:val="LightGrid-Accent1"/>
-        <w:tblW w:type="auto" w:w="0"/>
-        <w:tblLook w:firstColumn="1" w:firstRow="1" w:lastColumn="0" w:lastRow="0" w:noHBand="0" w:noVBand="1" w:val="04A0"/>
-      </w:tblPr>
-      <w:tblGrid>
-        <w:gridCol w:w="2160"/>
-        <w:gridCol w:w="2160"/>
-        <w:gridCol w:w="2160"/>
-        <w:gridCol w:w="2160"/>
-      </w:tblGrid>
-      <w:tr>
-        <w:tc>
-          <w:tcPr>
-            <w:tcW w:type="dxa" w:w="2160"/>
-          </w:tcPr>
-          <w:p>
-            <w:r>
-              <w:t>Component</w:t>
-            </w:r>
-          </w:p>
-        </w:tc>
-        <w:tc>
-          <w:tcPr>
-            <w:tcW w:type="dxa" w:w="2160"/>
-          </w:tcPr>
-          <w:p>
-            <w:r>
-              <w:t>Provider / Model</w:t>
-            </w:r>
-          </w:p>
-        </w:tc>
-        <w:tc>
-          <w:tcPr>
-            <w:tcW w:type="dxa" w:w="2160"/>
-          </w:tcPr>
-          <w:p>
-            <w:r>
-              <w:t>Used in Demo?</w:t>
-            </w:r>
-          </w:p>
-        </w:tc>
-        <w:tc>
-          <w:tcPr>
-            <w:tcW w:type="dxa" w:w="2160"/>
-          </w:tcPr>
-          <w:p>
-            <w:r>
-              <w:t>Purpose</w:t>
-            </w:r>
-          </w:p>
-        </w:tc>
-      </w:tr>
-      <w:tr>
-        <w:tc>
-          <w:tcPr>
-            <w:tcW w:type="dxa" w:w="2160"/>
-          </w:tcPr>
-          <w:p>
-            <w:r>
-              <w:t>Groq Q&amp;A (free, built-in)</w:t>
-            </w:r>
-          </w:p>
-        </w:tc>
-        <w:tc>
-          <w:tcPr>
-            <w:tcW w:type="dxa" w:w="2160"/>
-          </w:tcPr>
-          <w:p>
-            <w:r>
-              <w:t>Groq API (Llama 3.3 70B)</w:t>
-            </w:r>
-          </w:p>
-        </w:tc>
-        <w:tc>
-          <w:tcPr>
-            <w:tcW w:type="dxa" w:w="2160"/>
-          </w:tcPr>
-          <w:p>
-            <w:r>
-              <w:t>YES</w:t>
-            </w:r>
-          </w:p>
-        </w:tc>
-        <w:tc>
-          <w:tcPr>
-            <w:tcW w:type="dxa" w:w="2160"/>
-          </w:tcPr>
-          <w:p>
-            <w:r>
-              <w:t>Free AI Q&amp;A built into MatadorAudit -- users can ask follow-up questions about their audit with no setup required</w:t>
-            </w:r>
-          </w:p>
-        </w:tc>
-      </w:tr>
-      <w:tr>
-        <w:tc>
-          <w:tcPr>
-            <w:tcW w:type="dxa" w:w="2160"/>
-          </w:tcPr>
-          <w:p>
-            <w:r>
-              <w:t>Claude Fairness Reports</w:t>
-            </w:r>
-          </w:p>
-        </w:tc>
-        <w:tc>
-          <w:tcPr>
-            <w:tcW w:type="dxa" w:w="2160"/>
-          </w:tcPr>
-          <w:p>
-            <w:r>
-              <w:t>Anthropic Claude API</w:t>
-            </w:r>
-          </w:p>
-        </w:tc>
-        <w:tc>
-          <w:tcPr>
-            <w:tcW w:type="dxa" w:w="2160"/>
-          </w:tcPr>
-          <w:p>
-            <w:r>
-              <w:t>YES</w:t>
-            </w:r>
-          </w:p>
-        </w:tc>
-        <w:tc>
-          <w:tcPr>
-            <w:tcW w:type="dxa" w:w="2160"/>
-          </w:tcPr>
-          <w:p>
-            <w:r>
-              <w:t>Generates plain-English fairness report cards from statistical summaries</w:t>
-            </w:r>
-          </w:p>
-        </w:tc>
-      </w:tr>
-      <w:tr>
-        <w:tc>
-          <w:tcPr>
-            <w:tcW w:type="dxa" w:w="2160"/>
-          </w:tcPr>
-          <w:p>
-            <w:r>
-              <w:t>Claude Q&amp;A (optional)</w:t>
-            </w:r>
-          </w:p>
-        </w:tc>
-        <w:tc>
-          <w:tcPr>
-            <w:tcW w:type="dxa" w:w="2160"/>
-          </w:tcPr>
-          <w:p>
-            <w:r>
-              <w:t>Anthropic Claude API</w:t>
-            </w:r>
-          </w:p>
-        </w:tc>
-        <w:tc>
-          <w:tcPr>
-            <w:tcW w:type="dxa" w:w="2160"/>
-          </w:tcPr>
-          <w:p>
-            <w:r>
-              <w:t>Optional</w:t>
-            </w:r>
-          </w:p>
-        </w:tc>
-        <w:tc>
-          <w:tcPr>
-            <w:tcW w:type="dxa" w:w="2160"/>
-          </w:tcPr>
-          <w:p>
-            <w:r>
-              <w:t>Alternative AI Q&amp;A provider if user provides their own API key</w:t>
-            </w:r>
-          </w:p>
-        </w:tc>
-      </w:tr>
-      <w:tr>
-        <w:tc>
-          <w:tcPr>
-            <w:tcW w:type="dxa" w:w="2160"/>
-          </w:tcPr>
-          <w:p>
-            <w:r>
-              <w:t>ChatGPT Q&amp;A (optional)</w:t>
-            </w:r>
-          </w:p>
-        </w:tc>
-        <w:tc>
-          <w:tcPr>
-            <w:tcW w:type="dxa" w:w="2160"/>
-          </w:tcPr>
-          <w:p>
-            <w:r>
-              <w:t>OpenAI GPT API</w:t>
-            </w:r>
-          </w:p>
-        </w:tc>
-        <w:tc>
-          <w:tcPr>
-            <w:tcW w:type="dxa" w:w="2160"/>
-          </w:tcPr>
-          <w:p>
-            <w:r>
-              <w:t>Optional</w:t>
-            </w:r>
-          </w:p>
-        </w:tc>
-        <w:tc>
-          <w:tcPr>
-            <w:tcW w:type="dxa" w:w="2160"/>
-          </w:tcPr>
-          <w:p>
-            <w:r>
-              <w:t>Alternative AI Q&amp;A provider if user provides their own API key</w:t>
-            </w:r>
-          </w:p>
-        </w:tc>
-      </w:tr>
-      <w:tr>
-        <w:tc>
-          <w:tcPr>
-            <w:tcW w:type="dxa" w:w="2160"/>
-          </w:tcPr>
-          <w:p>
-            <w:r>
-              <w:t>Gemini Q&amp;A (optional)</w:t>
-            </w:r>
-          </w:p>
-        </w:tc>
-        <w:tc>
-          <w:tcPr>
-            <w:tcW w:type="dxa" w:w="2160"/>
-          </w:tcPr>
-          <w:p>
-            <w:r>
-              <w:t>Google Gemini API</w:t>
-            </w:r>
-          </w:p>
-        </w:tc>
-        <w:tc>
-          <w:tcPr>
-            <w:tcW w:type="dxa" w:w="2160"/>
-          </w:tcPr>
-          <w:p>
-            <w:r>
-              <w:t>Optional</w:t>
-            </w:r>
-          </w:p>
-        </w:tc>
-        <w:tc>
-          <w:tcPr>
-            <w:tcW w:type="dxa" w:w="2160"/>
-          </w:tcPr>
-          <w:p>
-            <w:r>
-              <w:t>Alternative AI Q&amp;A provider if user provides their own API key</w:t>
-            </w:r>
-          </w:p>
-        </w:tc>
-      </w:tr>
-      <w:tr>
-        <w:tc>
-          <w:tcPr>
-            <w:tcW w:type="dxa" w:w="2160"/>
-          </w:tcPr>
-          <w:p>
-            <w:r>
-              <w:t>Ollama Q&amp;A (optional)</w:t>
-            </w:r>
-          </w:p>
-        </w:tc>
-        <w:tc>
-          <w:tcPr>
-            <w:tcW w:type="dxa" w:w="2160"/>
-          </w:tcPr>
-          <w:p>
-            <w:r>
-              <w:t>Ollama (local models)</w:t>
-            </w:r>
-          </w:p>
-        </w:tc>
-        <w:tc>
-          <w:tcPr>
-            <w:tcW w:type="dxa" w:w="2160"/>
-          </w:tcPr>
-          <w:p>
-            <w:r>
-              <w:t>Optional</w:t>
-            </w:r>
-          </w:p>
-        </w:tc>
-        <w:tc>
-          <w:tcPr>
-            <w:tcW w:type="dxa" w:w="2160"/>
-          </w:tcPr>
-          <w:p>
-            <w:r>
-              <w:t>Local AI Q&amp;A for users who want to run models on their own machine</w:t>
-            </w:r>
-          </w:p>
-        </w:tc>
-      </w:tr>
-      <w:tr>
-        <w:tc>
-          <w:tcPr>
-            <w:tcW w:type="dxa" w:w="2160"/>
-          </w:tcPr>
-          <w:p>
-            <w:r>
-              <w:t>Copilot mode (optional)</w:t>
-            </w:r>
-          </w:p>
-        </w:tc>
-        <w:tc>
-          <w:tcPr>
-            <w:tcW w:type="dxa" w:w="2160"/>
-          </w:tcPr>
-          <w:p>
-            <w:r>
-              <w:t>Copy-paste to any AI</w:t>
-            </w:r>
-          </w:p>
-        </w:tc>
-        <w:tc>
-          <w:tcPr>
-            <w:tcW w:type="dxa" w:w="2160"/>
-          </w:tcPr>
-          <w:p>
-            <w:r>
-              <w:t>Optional</w:t>
-            </w:r>
-          </w:p>
-        </w:tc>
-        <w:tc>
-          <w:tcPr>
-            <w:tcW w:type="dxa" w:w="2160"/>
-          </w:tcPr>
-          <w:p>
-            <w:r>
-              <w:t>Copies audit context to clipboard so users can paste into any AI assistant</w:t>
-            </w:r>
-          </w:p>
-        </w:tc>
-      </w:tr>
-    </w:tbl>
-    <w:p/>
     <w:p>
       <w:r>
-        <w:rPr>
-          <w:b/>
-        </w:rPr>
-        <w:t xml:space="preserve">Note: </w:t>
-      </w:r>
-      <w:r>
-        <w:t>Groq is the default free option that works out of the box with no user setup. Claude, ChatGPT, Gemini, and Ollama are optional alternatives that users can configure if they prefer a different AI provider.</w:t>
+        <w:t>Own Python implementation. Computes demographic parity, equalized odds, and disparate impact ratio. No external dependencies -- no scipy, no Fairlearn, no AIF360 imports.</w:t>
       </w:r>
     </w:p>
-    <w:p/>
     <w:p>
       <w:pPr>
         <w:pStyle w:val="Heading2"/>
       </w:pPr>
       <w:r>
-        <w:t>What AI Does NOT Do</w:t>
+        <w:t>AI Q&amp;A Assistant (Default: OpenRouter -- Free)</w:t>
+      </w:r>
+    </w:p>
+    <w:p>
+      <w:r>
+        <w:t>OpenRouter is the default AI Q&amp;A provider. Completely free with a built-in API key -- no user setup required. Uses Nvidia Nemotron, GPT-OSS, Gemma, and Liquid models.</w:t>
+      </w:r>
+    </w:p>
+    <w:p>
+      <w:pPr>
+        <w:pStyle w:val="Heading2"/>
+      </w:pPr>
+      <w:r>
+        <w:t>AI Report Generation (Optional: Claude API)</w:t>
+      </w:r>
+    </w:p>
+    <w:p>
+      <w:r>
+        <w:t>Users can optionally connect their own Anthropic Claude API key to generate detailed plain-English fairness reports. This is not required -- the tool works fully without it.</w:t>
+      </w:r>
+    </w:p>
+    <w:p>
+      <w:pPr>
+        <w:pStyle w:val="Heading2"/>
+      </w:pPr>
+      <w:r>
+        <w:t>Alternative AI Q&amp;A Providers</w:t>
       </w:r>
     </w:p>
     <w:p>
@@ -938,7 +247,7 @@
         <w:pStyle w:val="ListBullet"/>
       </w:pPr>
       <w:r>
-        <w:t>AI never receives raw student data -- only statistical summaries</w:t>
+        <w:t>ChatGPT (user provides OpenAI key)</w:t>
       </w:r>
     </w:p>
     <w:p>
@@ -946,7 +255,7 @@
         <w:pStyle w:val="ListBullet"/>
       </w:pPr>
       <w:r>
-        <w:t>AI does not make decisions or automatically debias systems</w:t>
+        <w:t>Gemini (user provides Google key)</w:t>
       </w:r>
     </w:p>
     <w:p>
@@ -954,7 +263,28 @@
         <w:pStyle w:val="ListBullet"/>
       </w:pPr>
       <w:r>
-        <w:t>AI does not access any real CSUN systems or databases</w:t>
+        <w:t>Copilot (accessible via CSUN Microsoft 365)</w:t>
+      </w:r>
+    </w:p>
+    <w:p>
+      <w:pPr>
+        <w:pStyle w:val="Heading2"/>
+      </w:pPr>
+      <w:r>
+        <w:t>Dashboard</w:t>
+      </w:r>
+    </w:p>
+    <w:p>
+      <w:r>
+        <w:t>Streamlit + Plotly. Native Streamlit components for the Fairness Report Card. Plotly for interactive charts in the Multi-Audit Dashboard and What-If Simulator.</w:t>
+      </w:r>
+    </w:p>
+    <w:p>
+      <w:pPr>
+        <w:pStyle w:val="Heading2"/>
+      </w:pPr>
+      <w:r>
+        <w:t>What We Do NOT Use</w:t>
       </w:r>
     </w:p>
     <w:p>
@@ -962,7 +292,39 @@
         <w:pStyle w:val="ListBullet"/>
       </w:pPr>
       <w:r>
-        <w:t>All fairness metrics are computed locally using our own code -- AI is used only for natural-language explanations and Q&amp;A</w:t>
+        <w:t>No Ollama (removed)</w:t>
+      </w:r>
+    </w:p>
+    <w:p>
+      <w:pPr>
+        <w:pStyle w:val="ListBullet"/>
+      </w:pPr>
+      <w:r>
+        <w:t>No Groq (removed)</w:t>
+      </w:r>
+    </w:p>
+    <w:p>
+      <w:pPr>
+        <w:pStyle w:val="ListBullet"/>
+      </w:pPr>
+      <w:r>
+        <w:t>No Fairlearn imports (own implementation)</w:t>
+      </w:r>
+    </w:p>
+    <w:p>
+      <w:pPr>
+        <w:pStyle w:val="ListBullet"/>
+      </w:pPr>
+      <w:r>
+        <w:t>No AIF360 imports (own implementation)</w:t>
+      </w:r>
+    </w:p>
+    <w:p>
+      <w:pPr>
+        <w:pStyle w:val="ListBullet"/>
+      </w:pPr>
+      <w:r>
+        <w:t>No scipy imports</w:t>
       </w:r>
     </w:p>
     <w:p/>
@@ -974,210 +336,46 @@
         <w:t>Academic Sources for Fairness Metrics</w:t>
       </w:r>
     </w:p>
-    <w:tbl>
-      <w:tblPr>
-        <w:tblStyle w:val="LightGrid-Accent1"/>
-        <w:tblW w:type="auto" w:w="0"/>
-        <w:tblLook w:firstColumn="1" w:firstRow="1" w:lastColumn="0" w:lastRow="0" w:noHBand="0" w:noVBand="1" w:val="04A0"/>
-      </w:tblPr>
-      <w:tblGrid>
-        <w:gridCol w:w="2880"/>
-        <w:gridCol w:w="2880"/>
-        <w:gridCol w:w="2880"/>
-      </w:tblGrid>
-      <w:tr>
-        <w:tc>
-          <w:tcPr>
-            <w:tcW w:type="dxa" w:w="2880"/>
-          </w:tcPr>
-          <w:p>
-            <w:r>
-              <w:t>Citation</w:t>
-            </w:r>
-          </w:p>
-        </w:tc>
-        <w:tc>
-          <w:tcPr>
-            <w:tcW w:type="dxa" w:w="2880"/>
-          </w:tcPr>
-          <w:p>
-            <w:r>
-              <w:t>Concept</w:t>
-            </w:r>
-          </w:p>
-        </w:tc>
-        <w:tc>
-          <w:tcPr>
-            <w:tcW w:type="dxa" w:w="2880"/>
-          </w:tcPr>
-          <w:p>
-            <w:r>
-              <w:t>How We Use It</w:t>
-            </w:r>
-          </w:p>
-        </w:tc>
-      </w:tr>
-      <w:tr>
-        <w:tc>
-          <w:tcPr>
-            <w:tcW w:type="dxa" w:w="2880"/>
-          </w:tcPr>
-          <w:p>
-            <w:r>
-              <w:t>Dwork et al., 2012</w:t>
-            </w:r>
-          </w:p>
-        </w:tc>
-        <w:tc>
-          <w:tcPr>
-            <w:tcW w:type="dxa" w:w="2880"/>
-          </w:tcPr>
-          <w:p>
-            <w:r>
-              <w:t>Individual Fairness</w:t>
-            </w:r>
-          </w:p>
-        </w:tc>
-        <w:tc>
-          <w:tcPr>
-            <w:tcW w:type="dxa" w:w="2880"/>
-          </w:tcPr>
-          <w:p>
-            <w:r>
-              <w:t>Framework for treating similar individuals similarly</w:t>
-            </w:r>
-          </w:p>
-        </w:tc>
-      </w:tr>
-      <w:tr>
-        <w:tc>
-          <w:tcPr>
-            <w:tcW w:type="dxa" w:w="2880"/>
-          </w:tcPr>
-          <w:p>
-            <w:r>
-              <w:t>EEOC, 1978</w:t>
-            </w:r>
-          </w:p>
-        </w:tc>
-        <w:tc>
-          <w:tcPr>
-            <w:tcW w:type="dxa" w:w="2880"/>
-          </w:tcPr>
-          <w:p>
-            <w:r>
-              <w:t>Four-Fifths Rule (Disparate Impact)</w:t>
-            </w:r>
-          </w:p>
-        </w:tc>
-        <w:tc>
-          <w:tcPr>
-            <w:tcW w:type="dxa" w:w="2880"/>
-          </w:tcPr>
-          <w:p>
-            <w:r>
-              <w:t>Threshold for disparate impact ratio (0.80)</w:t>
-            </w:r>
-          </w:p>
-        </w:tc>
-      </w:tr>
-      <w:tr>
-        <w:tc>
-          <w:tcPr>
-            <w:tcW w:type="dxa" w:w="2880"/>
-          </w:tcPr>
-          <w:p>
-            <w:r>
-              <w:t>Hardt et al., 2016</w:t>
-            </w:r>
-          </w:p>
-        </w:tc>
-        <w:tc>
-          <w:tcPr>
-            <w:tcW w:type="dxa" w:w="2880"/>
-          </w:tcPr>
-          <w:p>
-            <w:r>
-              <w:t>Equalized Odds</w:t>
-            </w:r>
-          </w:p>
-        </w:tc>
-        <w:tc>
-          <w:tcPr>
-            <w:tcW w:type="dxa" w:w="2880"/>
-          </w:tcPr>
-          <w:p>
-            <w:r>
-              <w:t>Equal true positive and false positive rates across groups</w:t>
-            </w:r>
-          </w:p>
-        </w:tc>
-      </w:tr>
-      <w:tr>
-        <w:tc>
-          <w:tcPr>
-            <w:tcW w:type="dxa" w:w="2880"/>
-          </w:tcPr>
-          <w:p>
-            <w:r>
-              <w:t>Datta et al., 2015</w:t>
-            </w:r>
-          </w:p>
-        </w:tc>
-        <w:tc>
-          <w:tcPr>
-            <w:tcW w:type="dxa" w:w="2880"/>
-          </w:tcPr>
-          <w:p>
-            <w:r>
-              <w:t>Proxy Discrimination</w:t>
-            </w:r>
-          </w:p>
-        </w:tc>
-        <w:tc>
-          <w:tcPr>
-            <w:tcW w:type="dxa" w:w="2880"/>
-          </w:tcPr>
-          <w:p>
-            <w:r>
-              <w:t>Detecting indirect discrimination through correlated variables</w:t>
-            </w:r>
-          </w:p>
-        </w:tc>
-      </w:tr>
-      <w:tr>
-        <w:tc>
-          <w:tcPr>
-            <w:tcW w:type="dxa" w:w="2880"/>
-          </w:tcPr>
-          <w:p>
-            <w:r>
-              <w:t>Chouldechova, 2017</w:t>
-            </w:r>
-          </w:p>
-        </w:tc>
-        <w:tc>
-          <w:tcPr>
-            <w:tcW w:type="dxa" w:w="2880"/>
-          </w:tcPr>
-          <w:p>
-            <w:r>
-              <w:t>Fairness Metric Incompatibility</w:t>
-            </w:r>
-          </w:p>
-        </w:tc>
-        <w:tc>
-          <w:tcPr>
-            <w:tcW w:type="dxa" w:w="2880"/>
-          </w:tcPr>
-          <w:p>
-            <w:r>
-              <w:t>Why multiple metrics cannot be satisfied simultaneously</w:t>
-            </w:r>
-          </w:p>
-        </w:tc>
-      </w:tr>
-    </w:tbl>
+    <w:p>
+      <w:pPr>
+        <w:pStyle w:val="ListBullet"/>
+      </w:pPr>
+      <w:r>
+        <w:t>Dwork, C. et al. (2012). Fairness through awareness.</w:t>
+      </w:r>
+    </w:p>
+    <w:p>
+      <w:pPr>
+        <w:pStyle w:val="ListBullet"/>
+      </w:pPr>
+      <w:r>
+        <w:t>EEOC (1978). Uniform Guidelines on Employee Selection Procedures (four-fifths rule).</w:t>
+      </w:r>
+    </w:p>
+    <w:p>
+      <w:pPr>
+        <w:pStyle w:val="ListBullet"/>
+      </w:pPr>
+      <w:r>
+        <w:t>Hardt, M. et al. (2016). Equality of opportunity in supervised learning.</w:t>
+      </w:r>
+    </w:p>
+    <w:p>
+      <w:pPr>
+        <w:pStyle w:val="ListBullet"/>
+      </w:pPr>
+      <w:r>
+        <w:t>Datta, A. et al. (2015). Automated experiments on ad privacy settings.</w:t>
+      </w:r>
+    </w:p>
+    <w:p>
+      <w:pPr>
+        <w:pStyle w:val="ListBullet"/>
+      </w:pPr>
+      <w:r>
+        <w:t>Chouldechova, A. (2017). Fair prediction with disparate impact.</w:t>
+      </w:r>
+    </w:p>
     <w:sectPr>
       <w:pgSz w:w="12240" w:h="15840"/>
       <w:pgMar w:top="1440" w:right="1800" w:bottom="1440" w:left="1800" w:header="720" w:footer="720" w:gutter="0"/>

</xml_diff>